<commit_message>
## [v1.3.0] — 2026-06-11
### Añadido
- EC-DIS: Documento de Diseño (Arquitectura del Sistema) (V 1.0, G.Gargaglione)

### Modificado
- EC-SCM: Plan de Gestión de Configuraciones (V 2.2, G.Gargaglione)
- EC-SQA-PLN: Plan de SQA (V 1.1, G. Gargaglione)
- EC-SRC-PHP: Catálogo público de muebles con conexión dinámica a MariaDB (catalogo.php)
- EC-REQ: Especificación de requerimientos.

### Notas
- Tercer iteración
- Realizado el análisis de riesgos y agregados planes de contingencia y mitigación,
con énfasis en los riesgos "Factores personales" y "Falta de revisión entre pares".
- Agregado el requerimiento RF-10 (Ver detalle de mueble)
</commit_message>
<xml_diff>
--- a/docs/ingenieria/analisis/EC-REQ_requerimientos.docx
+++ b/docs/ingenieria/analisis/EC-REQ_requerimientos.docx
@@ -442,6 +442,7 @@
                 <w:sz w:val="22"/>
                 <w:szCs w:val="22"/>
               </w:rPr>
+              <w:t>2.0</w:t>
             </w:r>
           </w:p>
         </w:tc>
@@ -471,6 +472,7 @@
                 <w:sz w:val="22"/>
                 <w:szCs w:val="22"/>
               </w:rPr>
+              <w:t>11/06/2026</w:t>
             </w:r>
           </w:p>
         </w:tc>
@@ -500,6 +502,7 @@
                 <w:sz w:val="22"/>
                 <w:szCs w:val="22"/>
               </w:rPr>
+              <w:t>G. Gargaglione</w:t>
             </w:r>
           </w:p>
         </w:tc>
@@ -534,6 +537,7 @@
                 <w:sz w:val="22"/>
                 <w:szCs w:val="22"/>
               </w:rPr>
+              <w:t xml:space="preserve">Iteración 3 (V.1.3.0) se agrega RF-10 (Ver detalle de mueble) </w:t>
             </w:r>
           </w:p>
         </w:tc>
@@ -1059,6 +1063,7 @@
             <w:rPr>
               <w:webHidden/>
               <w:rStyle w:val="Enlacedelndice"/>
+              <w:vanish w:val="false"/>
             </w:rPr>
             <w:instrText xml:space="preserve"> TOC \z \o "1-3" \u \h</w:instrText>
           </w:r>
@@ -1066,6 +1071,7 @@
             <w:rPr>
               <w:webHidden/>
               <w:rStyle w:val="Enlacedelndice"/>
+              <w:vanish w:val="false"/>
             </w:rPr>
             <w:fldChar w:fldCharType="separate"/>
           </w:r>
@@ -1074,6 +1080,7 @@
               <w:rPr>
                 <w:webHidden/>
                 <w:rStyle w:val="Enlacedelndice"/>
+                <w:vanish w:val="false"/>
               </w:rPr>
               <w:t>Control de versiones del documento</w:t>
               <w:tab/>
@@ -1095,6 +1102,7 @@
               <w:rPr>
                 <w:webHidden/>
                 <w:rStyle w:val="Enlacedelndice"/>
+                <w:vanish w:val="false"/>
               </w:rPr>
               <w:t>1. INTRODUCCIÓN</w:t>
               <w:tab/>
@@ -1116,6 +1124,7 @@
               <w:rPr>
                 <w:webHidden/>
                 <w:rStyle w:val="Enlacedelndice"/>
+                <w:vanish w:val="false"/>
               </w:rPr>
               <w:t>1.1 Objetivo</w:t>
               <w:tab/>
@@ -1137,6 +1146,7 @@
               <w:rPr>
                 <w:webHidden/>
                 <w:rStyle w:val="Enlacedelndice"/>
+                <w:vanish w:val="false"/>
               </w:rPr>
               <w:t>2.2 Alcance</w:t>
               <w:tab/>
@@ -1158,6 +1168,7 @@
               <w:rPr>
                 <w:webHidden/>
                 <w:rStyle w:val="Enlacedelndice"/>
+                <w:vanish w:val="false"/>
               </w:rPr>
               <w:t>2.3 Abreviaturas</w:t>
               <w:tab/>
@@ -1179,6 +1190,7 @@
               <w:rPr>
                 <w:webHidden/>
                 <w:rStyle w:val="Enlacedelndice"/>
+                <w:vanish w:val="false"/>
               </w:rPr>
               <w:t>2. REQUERIMIENTOS FUNCIONALES</w:t>
               <w:tab/>
@@ -1200,6 +1212,7 @@
               <w:rPr>
                 <w:webHidden/>
                 <w:rStyle w:val="Enlacedelndice"/>
+                <w:vanish w:val="false"/>
               </w:rPr>
               <w:t>3. REQUERIMIENTOS NO FUNCIONALES</w:t>
               <w:tab/>
@@ -1209,6 +1222,7 @@
           <w:r>
             <w:rPr>
               <w:rStyle w:val="Enlacedelndice"/>
+              <w:vanish w:val="false"/>
             </w:rPr>
             <w:fldChar w:fldCharType="end"/>
           </w:r>
@@ -1450,8 +1464,8 @@
       </w:tblPr>
       <w:tblGrid>
         <w:gridCol w:w="1140"/>
-        <w:gridCol w:w="2548"/>
-        <w:gridCol w:w="5672"/>
+        <w:gridCol w:w="2547"/>
+        <w:gridCol w:w="5673"/>
       </w:tblGrid>
       <w:tr>
         <w:trPr>
@@ -1494,7 +1508,7 @@
         </w:tc>
         <w:tc>
           <w:tcPr>
-            <w:tcW w:w="2548" w:type="dxa"/>
+            <w:tcW w:w="2547" w:type="dxa"/>
             <w:tcBorders>
               <w:top w:val="single" w:sz="6" w:space="0" w:color="7F7F7F"/>
               <w:left w:val="single" w:sz="6" w:space="0" w:color="7F7F7F"/>
@@ -1528,7 +1542,7 @@
         </w:tc>
         <w:tc>
           <w:tcPr>
-            <w:tcW w:w="5672" w:type="dxa"/>
+            <w:tcW w:w="5673" w:type="dxa"/>
             <w:tcBorders>
               <w:top w:val="single" w:sz="6" w:space="0" w:color="7F7F7F"/>
               <w:left w:val="single" w:sz="6" w:space="0" w:color="7F7F7F"/>
@@ -1610,7 +1624,7 @@
         </w:tc>
         <w:tc>
           <w:tcPr>
-            <w:tcW w:w="2548" w:type="dxa"/>
+            <w:tcW w:w="2547" w:type="dxa"/>
             <w:tcBorders>
               <w:top w:val="single" w:sz="6" w:space="0" w:color="7F7F7F"/>
               <w:left w:val="single" w:sz="6" w:space="0" w:color="7F7F7F"/>
@@ -1640,7 +1654,7 @@
         </w:tc>
         <w:tc>
           <w:tcPr>
-            <w:tcW w:w="5672" w:type="dxa"/>
+            <w:tcW w:w="5673" w:type="dxa"/>
             <w:tcBorders>
               <w:top w:val="single" w:sz="6" w:space="0" w:color="7F7F7F"/>
               <w:left w:val="single" w:sz="6" w:space="0" w:color="7F7F7F"/>
@@ -1707,7 +1721,7 @@
         </w:tc>
         <w:tc>
           <w:tcPr>
-            <w:tcW w:w="2548" w:type="dxa"/>
+            <w:tcW w:w="2547" w:type="dxa"/>
             <w:tcBorders>
               <w:top w:val="single" w:sz="6" w:space="0" w:color="7F7F7F"/>
               <w:left w:val="single" w:sz="6" w:space="0" w:color="7F7F7F"/>
@@ -1737,7 +1751,7 @@
         </w:tc>
         <w:tc>
           <w:tcPr>
-            <w:tcW w:w="5672" w:type="dxa"/>
+            <w:tcW w:w="5673" w:type="dxa"/>
             <w:tcBorders>
               <w:top w:val="single" w:sz="6" w:space="0" w:color="7F7F7F"/>
               <w:left w:val="single" w:sz="6" w:space="0" w:color="7F7F7F"/>
@@ -1804,7 +1818,7 @@
         </w:tc>
         <w:tc>
           <w:tcPr>
-            <w:tcW w:w="2548" w:type="dxa"/>
+            <w:tcW w:w="2547" w:type="dxa"/>
             <w:tcBorders>
               <w:top w:val="single" w:sz="6" w:space="0" w:color="7F7F7F"/>
               <w:left w:val="single" w:sz="6" w:space="0" w:color="7F7F7F"/>
@@ -1834,7 +1848,7 @@
         </w:tc>
         <w:tc>
           <w:tcPr>
-            <w:tcW w:w="5672" w:type="dxa"/>
+            <w:tcW w:w="5673" w:type="dxa"/>
             <w:tcBorders>
               <w:top w:val="single" w:sz="6" w:space="0" w:color="7F7F7F"/>
               <w:left w:val="single" w:sz="6" w:space="0" w:color="7F7F7F"/>
@@ -1900,7 +1914,7 @@
         </w:tc>
         <w:tc>
           <w:tcPr>
-            <w:tcW w:w="2548" w:type="dxa"/>
+            <w:tcW w:w="2547" w:type="dxa"/>
             <w:tcBorders>
               <w:left w:val="single" w:sz="6" w:space="0" w:color="7F7F7F"/>
               <w:bottom w:val="single" w:sz="6" w:space="0" w:color="7F7F7F"/>
@@ -1929,7 +1943,7 @@
         </w:tc>
         <w:tc>
           <w:tcPr>
-            <w:tcW w:w="5672" w:type="dxa"/>
+            <w:tcW w:w="5673" w:type="dxa"/>
             <w:tcBorders>
               <w:left w:val="single" w:sz="6" w:space="0" w:color="7F7F7F"/>
               <w:bottom w:val="single" w:sz="6" w:space="0" w:color="7F7F7F"/>
@@ -1994,7 +2008,7 @@
         </w:tc>
         <w:tc>
           <w:tcPr>
-            <w:tcW w:w="2548" w:type="dxa"/>
+            <w:tcW w:w="2547" w:type="dxa"/>
             <w:tcBorders>
               <w:left w:val="single" w:sz="6" w:space="0" w:color="7F7F7F"/>
               <w:bottom w:val="single" w:sz="6" w:space="0" w:color="7F7F7F"/>
@@ -2023,7 +2037,7 @@
         </w:tc>
         <w:tc>
           <w:tcPr>
-            <w:tcW w:w="5672" w:type="dxa"/>
+            <w:tcW w:w="5673" w:type="dxa"/>
             <w:tcBorders>
               <w:left w:val="single" w:sz="6" w:space="0" w:color="7F7F7F"/>
               <w:bottom w:val="single" w:sz="6" w:space="0" w:color="7F7F7F"/>
@@ -2088,7 +2102,7 @@
         </w:tc>
         <w:tc>
           <w:tcPr>
-            <w:tcW w:w="2548" w:type="dxa"/>
+            <w:tcW w:w="2547" w:type="dxa"/>
             <w:tcBorders>
               <w:left w:val="single" w:sz="6" w:space="0" w:color="7F7F7F"/>
               <w:bottom w:val="single" w:sz="6" w:space="0" w:color="7F7F7F"/>
@@ -2117,7 +2131,7 @@
         </w:tc>
         <w:tc>
           <w:tcPr>
-            <w:tcW w:w="5672" w:type="dxa"/>
+            <w:tcW w:w="5673" w:type="dxa"/>
             <w:tcBorders>
               <w:left w:val="single" w:sz="6" w:space="0" w:color="7F7F7F"/>
               <w:bottom w:val="single" w:sz="6" w:space="0" w:color="7F7F7F"/>
@@ -2182,7 +2196,7 @@
         </w:tc>
         <w:tc>
           <w:tcPr>
-            <w:tcW w:w="2548" w:type="dxa"/>
+            <w:tcW w:w="2547" w:type="dxa"/>
             <w:tcBorders>
               <w:left w:val="single" w:sz="6" w:space="0" w:color="7F7F7F"/>
               <w:bottom w:val="single" w:sz="6" w:space="0" w:color="7F7F7F"/>
@@ -2211,7 +2225,7 @@
         </w:tc>
         <w:tc>
           <w:tcPr>
-            <w:tcW w:w="5672" w:type="dxa"/>
+            <w:tcW w:w="5673" w:type="dxa"/>
             <w:tcBorders>
               <w:left w:val="single" w:sz="6" w:space="0" w:color="7F7F7F"/>
               <w:bottom w:val="single" w:sz="6" w:space="0" w:color="7F7F7F"/>
@@ -2276,7 +2290,7 @@
         </w:tc>
         <w:tc>
           <w:tcPr>
-            <w:tcW w:w="2548" w:type="dxa"/>
+            <w:tcW w:w="2547" w:type="dxa"/>
             <w:tcBorders>
               <w:left w:val="single" w:sz="6" w:space="0" w:color="7F7F7F"/>
               <w:bottom w:val="single" w:sz="6" w:space="0" w:color="7F7F7F"/>
@@ -2305,7 +2319,7 @@
         </w:tc>
         <w:tc>
           <w:tcPr>
-            <w:tcW w:w="5672" w:type="dxa"/>
+            <w:tcW w:w="5673" w:type="dxa"/>
             <w:tcBorders>
               <w:left w:val="single" w:sz="6" w:space="0" w:color="7F7F7F"/>
               <w:bottom w:val="single" w:sz="6" w:space="0" w:color="7F7F7F"/>
@@ -2370,7 +2384,7 @@
         </w:tc>
         <w:tc>
           <w:tcPr>
-            <w:tcW w:w="2548" w:type="dxa"/>
+            <w:tcW w:w="2547" w:type="dxa"/>
             <w:tcBorders>
               <w:left w:val="single" w:sz="6" w:space="0" w:color="7F7F7F"/>
               <w:bottom w:val="single" w:sz="6" w:space="0" w:color="7F7F7F"/>
@@ -2399,7 +2413,7 @@
         </w:tc>
         <w:tc>
           <w:tcPr>
-            <w:tcW w:w="5672" w:type="dxa"/>
+            <w:tcW w:w="5673" w:type="dxa"/>
             <w:tcBorders>
               <w:left w:val="single" w:sz="6" w:space="0" w:color="7F7F7F"/>
               <w:bottom w:val="single" w:sz="6" w:space="0" w:color="7F7F7F"/>
@@ -2423,6 +2437,100 @@
                 <w:szCs w:val="22"/>
               </w:rPr>
               <w:t xml:space="preserve">El administrador podrá crear, modificar y eliminar categorías de muebles desde el panel de administración. </w:t>
+            </w:r>
+          </w:p>
+        </w:tc>
+      </w:tr>
+      <w:tr>
+        <w:trPr/>
+        <w:tc>
+          <w:tcPr>
+            <w:tcW w:w="1140" w:type="dxa"/>
+            <w:tcBorders>
+              <w:left w:val="single" w:sz="6" w:space="0" w:color="7F7F7F"/>
+              <w:bottom w:val="single" w:sz="6" w:space="0" w:color="7F7F7F"/>
+              <w:right w:val="single" w:sz="6" w:space="0" w:color="7F7F7F"/>
+            </w:tcBorders>
+            <w:shd w:color="auto" w:fill="auto" w:val="clear"/>
+          </w:tcPr>
+          <w:p>
+            <w:pPr>
+              <w:pStyle w:val="Normal"/>
+              <w:widowControl w:val="false"/>
+              <w:spacing w:before="120" w:after="120"/>
+              <w:rPr>
+                <w:b/>
+                <w:bCs/>
+                <w:sz w:val="22"/>
+                <w:szCs w:val="22"/>
+              </w:rPr>
+            </w:pPr>
+            <w:r>
+              <w:rPr>
+                <w:b/>
+                <w:bCs/>
+                <w:sz w:val="22"/>
+                <w:szCs w:val="22"/>
+              </w:rPr>
+              <w:t>RF-10</w:t>
+            </w:r>
+          </w:p>
+        </w:tc>
+        <w:tc>
+          <w:tcPr>
+            <w:tcW w:w="2547" w:type="dxa"/>
+            <w:tcBorders>
+              <w:left w:val="single" w:sz="6" w:space="0" w:color="7F7F7F"/>
+              <w:bottom w:val="single" w:sz="6" w:space="0" w:color="7F7F7F"/>
+              <w:right w:val="single" w:sz="6" w:space="0" w:color="7F7F7F"/>
+            </w:tcBorders>
+            <w:shd w:color="auto" w:fill="auto" w:val="clear"/>
+          </w:tcPr>
+          <w:p>
+            <w:pPr>
+              <w:pStyle w:val="Normal"/>
+              <w:widowControl w:val="false"/>
+              <w:spacing w:before="120" w:after="120"/>
+              <w:rPr>
+                <w:sz w:val="22"/>
+                <w:szCs w:val="22"/>
+              </w:rPr>
+            </w:pPr>
+            <w:r>
+              <w:rPr>
+                <w:sz w:val="22"/>
+                <w:szCs w:val="22"/>
+              </w:rPr>
+              <w:t>Ver detalle de mueble</w:t>
+            </w:r>
+          </w:p>
+        </w:tc>
+        <w:tc>
+          <w:tcPr>
+            <w:tcW w:w="5673" w:type="dxa"/>
+            <w:tcBorders>
+              <w:left w:val="single" w:sz="6" w:space="0" w:color="7F7F7F"/>
+              <w:bottom w:val="single" w:sz="6" w:space="0" w:color="7F7F7F"/>
+              <w:right w:val="single" w:sz="6" w:space="0" w:color="7F7F7F"/>
+            </w:tcBorders>
+            <w:shd w:color="auto" w:fill="auto" w:val="clear"/>
+          </w:tcPr>
+          <w:p>
+            <w:pPr>
+              <w:pStyle w:val="Normal"/>
+              <w:widowControl w:val="false"/>
+              <w:spacing w:before="120" w:after="120"/>
+              <w:rPr>
+                <w:sz w:val="22"/>
+                <w:szCs w:val="22"/>
+              </w:rPr>
+            </w:pPr>
+            <w:r>
+              <w:rPr>
+                <w:sz w:val="22"/>
+                <w:szCs w:val="22"/>
+              </w:rPr>
+              <w:t>El usuario podrá hacer click sobre un mueble del catálogo para visualizar su información completa en un modal, incluyendo descripción, categoría, dimensiones y peso, sin abandonar la página del catálogo.</w:t>
             </w:r>
           </w:p>
         </w:tc>
@@ -2498,8 +2606,8 @@
       </w:tblPr>
       <w:tblGrid>
         <w:gridCol w:w="1140"/>
-        <w:gridCol w:w="1873"/>
-        <w:gridCol w:w="6347"/>
+        <w:gridCol w:w="1872"/>
+        <w:gridCol w:w="6348"/>
       </w:tblGrid>
       <w:tr>
         <w:trPr>
@@ -2542,7 +2650,7 @@
         </w:tc>
         <w:tc>
           <w:tcPr>
-            <w:tcW w:w="1873" w:type="dxa"/>
+            <w:tcW w:w="1872" w:type="dxa"/>
             <w:tcBorders>
               <w:top w:val="single" w:sz="6" w:space="0" w:color="7F7F7F"/>
               <w:left w:val="single" w:sz="6" w:space="0" w:color="7F7F7F"/>
@@ -2576,7 +2684,7 @@
         </w:tc>
         <w:tc>
           <w:tcPr>
-            <w:tcW w:w="6347" w:type="dxa"/>
+            <w:tcW w:w="6348" w:type="dxa"/>
             <w:tcBorders>
               <w:top w:val="single" w:sz="6" w:space="0" w:color="7F7F7F"/>
               <w:left w:val="single" w:sz="6" w:space="0" w:color="7F7F7F"/>
@@ -2658,7 +2766,7 @@
         </w:tc>
         <w:tc>
           <w:tcPr>
-            <w:tcW w:w="1873" w:type="dxa"/>
+            <w:tcW w:w="1872" w:type="dxa"/>
             <w:tcBorders>
               <w:top w:val="single" w:sz="6" w:space="0" w:color="7F7F7F"/>
               <w:left w:val="single" w:sz="6" w:space="0" w:color="7F7F7F"/>
@@ -2688,7 +2796,7 @@
         </w:tc>
         <w:tc>
           <w:tcPr>
-            <w:tcW w:w="6347" w:type="dxa"/>
+            <w:tcW w:w="6348" w:type="dxa"/>
             <w:tcBorders>
               <w:top w:val="single" w:sz="6" w:space="0" w:color="7F7F7F"/>
               <w:left w:val="single" w:sz="6" w:space="0" w:color="7F7F7F"/>
@@ -2755,7 +2863,7 @@
         </w:tc>
         <w:tc>
           <w:tcPr>
-            <w:tcW w:w="1873" w:type="dxa"/>
+            <w:tcW w:w="1872" w:type="dxa"/>
             <w:tcBorders>
               <w:top w:val="single" w:sz="6" w:space="0" w:color="7F7F7F"/>
               <w:left w:val="single" w:sz="6" w:space="0" w:color="7F7F7F"/>
@@ -2785,7 +2893,7 @@
         </w:tc>
         <w:tc>
           <w:tcPr>
-            <w:tcW w:w="6347" w:type="dxa"/>
+            <w:tcW w:w="6348" w:type="dxa"/>
             <w:tcBorders>
               <w:top w:val="single" w:sz="6" w:space="0" w:color="7F7F7F"/>
               <w:left w:val="single" w:sz="6" w:space="0" w:color="7F7F7F"/>
@@ -2852,7 +2960,7 @@
         </w:tc>
         <w:tc>
           <w:tcPr>
-            <w:tcW w:w="1873" w:type="dxa"/>
+            <w:tcW w:w="1872" w:type="dxa"/>
             <w:tcBorders>
               <w:top w:val="single" w:sz="6" w:space="0" w:color="7F7F7F"/>
               <w:left w:val="single" w:sz="6" w:space="0" w:color="7F7F7F"/>
@@ -2882,7 +2990,7 @@
         </w:tc>
         <w:tc>
           <w:tcPr>
-            <w:tcW w:w="6347" w:type="dxa"/>
+            <w:tcW w:w="6348" w:type="dxa"/>
             <w:tcBorders>
               <w:top w:val="single" w:sz="6" w:space="0" w:color="7F7F7F"/>
               <w:left w:val="single" w:sz="6" w:space="0" w:color="7F7F7F"/>
@@ -2948,7 +3056,7 @@
         </w:tc>
         <w:tc>
           <w:tcPr>
-            <w:tcW w:w="1873" w:type="dxa"/>
+            <w:tcW w:w="1872" w:type="dxa"/>
             <w:tcBorders>
               <w:left w:val="single" w:sz="6" w:space="0" w:color="7F7F7F"/>
               <w:bottom w:val="single" w:sz="6" w:space="0" w:color="7F7F7F"/>
@@ -2977,7 +3085,7 @@
         </w:tc>
         <w:tc>
           <w:tcPr>
-            <w:tcW w:w="6347" w:type="dxa"/>
+            <w:tcW w:w="6348" w:type="dxa"/>
             <w:tcBorders>
               <w:left w:val="single" w:sz="6" w:space="0" w:color="7F7F7F"/>
               <w:bottom w:val="single" w:sz="6" w:space="0" w:color="7F7F7F"/>
@@ -3042,7 +3150,7 @@
         </w:tc>
         <w:tc>
           <w:tcPr>
-            <w:tcW w:w="1873" w:type="dxa"/>
+            <w:tcW w:w="1872" w:type="dxa"/>
             <w:tcBorders>
               <w:left w:val="single" w:sz="6" w:space="0" w:color="7F7F7F"/>
               <w:bottom w:val="single" w:sz="6" w:space="0" w:color="7F7F7F"/>
@@ -3071,7 +3179,7 @@
         </w:tc>
         <w:tc>
           <w:tcPr>
-            <w:tcW w:w="6347" w:type="dxa"/>
+            <w:tcW w:w="6348" w:type="dxa"/>
             <w:tcBorders>
               <w:left w:val="single" w:sz="6" w:space="0" w:color="7F7F7F"/>
               <w:bottom w:val="single" w:sz="6" w:space="0" w:color="7F7F7F"/>
@@ -3136,7 +3244,7 @@
         </w:tc>
         <w:tc>
           <w:tcPr>
-            <w:tcW w:w="1873" w:type="dxa"/>
+            <w:tcW w:w="1872" w:type="dxa"/>
             <w:tcBorders>
               <w:left w:val="single" w:sz="6" w:space="0" w:color="7F7F7F"/>
               <w:bottom w:val="single" w:sz="6" w:space="0" w:color="7F7F7F"/>
@@ -3165,7 +3273,7 @@
         </w:tc>
         <w:tc>
           <w:tcPr>
-            <w:tcW w:w="6347" w:type="dxa"/>
+            <w:tcW w:w="6348" w:type="dxa"/>
             <w:tcBorders>
               <w:left w:val="single" w:sz="6" w:space="0" w:color="7F7F7F"/>
               <w:bottom w:val="single" w:sz="6" w:space="0" w:color="7F7F7F"/>
@@ -3230,7 +3338,7 @@
         </w:tc>
         <w:tc>
           <w:tcPr>
-            <w:tcW w:w="1873" w:type="dxa"/>
+            <w:tcW w:w="1872" w:type="dxa"/>
             <w:tcBorders>
               <w:left w:val="single" w:sz="6" w:space="0" w:color="7F7F7F"/>
               <w:bottom w:val="single" w:sz="6" w:space="0" w:color="7F7F7F"/>
@@ -3259,7 +3367,7 @@
         </w:tc>
         <w:tc>
           <w:tcPr>
-            <w:tcW w:w="6347" w:type="dxa"/>
+            <w:tcW w:w="6348" w:type="dxa"/>
             <w:tcBorders>
               <w:left w:val="single" w:sz="6" w:space="0" w:color="7F7F7F"/>
               <w:bottom w:val="single" w:sz="6" w:space="0" w:color="7F7F7F"/>
@@ -3330,7 +3438,7 @@
     <w:r>
       <w:rPr/>
       <w:drawing>
-        <wp:anchor behindDoc="1" distT="0" distB="0" distL="0" distR="0" simplePos="0" locked="0" layoutInCell="0" allowOverlap="1" relativeHeight="3">
+        <wp:anchor behindDoc="0" distT="0" distB="0" distL="0" distR="0" simplePos="0" locked="0" layoutInCell="0" allowOverlap="1" relativeHeight="3">
           <wp:simplePos x="0" y="0"/>
           <wp:positionH relativeFrom="column">
             <wp:posOffset>-914400</wp:posOffset>
@@ -3389,7 +3497,7 @@
     <w:r>
       <w:rPr/>
       <w:drawing>
-        <wp:anchor behindDoc="1" distT="0" distB="0" distL="0" distR="0" simplePos="0" locked="0" layoutInCell="0" allowOverlap="1" relativeHeight="7">
+        <wp:anchor behindDoc="0" distT="0" distB="0" distL="0" distR="0" simplePos="0" locked="0" layoutInCell="0" allowOverlap="1" relativeHeight="7">
           <wp:simplePos x="0" y="0"/>
           <wp:positionH relativeFrom="column">
             <wp:posOffset>-914400</wp:posOffset>
@@ -3454,7 +3562,7 @@
     <w:r>
       <w:rPr/>
       <w:drawing>
-        <wp:anchor behindDoc="1" distT="0" distB="0" distL="0" distR="0" simplePos="0" locked="0" layoutInCell="0" allowOverlap="1" relativeHeight="15">
+        <wp:anchor behindDoc="0" distT="0" distB="0" distL="0" distR="0" simplePos="0" locked="0" layoutInCell="0" allowOverlap="1" relativeHeight="15">
           <wp:simplePos x="0" y="0"/>
           <wp:positionH relativeFrom="column">
             <wp:posOffset>-914400</wp:posOffset>
@@ -3519,7 +3627,7 @@
     <w:r>
       <w:rPr/>
       <w:drawing>
-        <wp:anchor behindDoc="1" distT="0" distB="0" distL="0" distR="0" simplePos="0" locked="0" layoutInCell="0" allowOverlap="1" relativeHeight="2">
+        <wp:anchor behindDoc="0" distT="0" distB="0" distL="0" distR="0" simplePos="0" locked="0" layoutInCell="0" allowOverlap="1" relativeHeight="2">
           <wp:simplePos x="0" y="0"/>
           <wp:positionH relativeFrom="column">
             <wp:posOffset>-918845</wp:posOffset>
@@ -3578,7 +3686,7 @@
     <w:r>
       <w:rPr/>
       <w:drawing>
-        <wp:anchor behindDoc="1" distT="0" distB="0" distL="0" distR="0" simplePos="0" locked="0" layoutInCell="0" allowOverlap="1" relativeHeight="4">
+        <wp:anchor behindDoc="0" distT="0" distB="0" distL="0" distR="0" simplePos="0" locked="0" layoutInCell="0" allowOverlap="1" relativeHeight="4">
           <wp:simplePos x="0" y="0"/>
           <wp:positionH relativeFrom="column">
             <wp:posOffset>-918845</wp:posOffset>
@@ -3643,7 +3751,7 @@
     <w:r>
       <w:rPr/>
       <w:drawing>
-        <wp:anchor behindDoc="1" distT="0" distB="0" distL="0" distR="0" simplePos="0" locked="0" layoutInCell="0" allowOverlap="1" relativeHeight="11">
+        <wp:anchor behindDoc="0" distT="0" distB="0" distL="0" distR="0" simplePos="0" locked="0" layoutInCell="0" allowOverlap="1" relativeHeight="11">
           <wp:simplePos x="0" y="0"/>
           <wp:positionH relativeFrom="column">
             <wp:posOffset>-918845</wp:posOffset>

</xml_diff>